<commit_message>
Rewrite education section to focus on implications rather than lecture summary
Co-authored-by: fatimai146 <fatimai146@users.noreply.github.com>
</commit_message>
<xml_diff>
--- a/Reflection_Paper_Sept3_Zhihong_Chen.docx
+++ b/Reflection_Paper_Sept3_Zhihong_Chen.docx
@@ -14,18 +14,28 @@
     </w:p>
     <w:p>
       <w:pPr>
+        <w:spacing w:line="480" w:lineRule="auto"/>
         <w:ind w:firstLine="720"/>
       </w:pPr>
       <w:r>
-        <w:t>Dr. Chen's lecture made a convincing case that the way universities teach needs to evolve alongside the industries they feed into. The Birck Nanotechnology Center is not just a research facility. It has become an educational platform in its own right. The Vertically Integrated Project program she described, where undergraduate students get hands on training inside a real cleanroom, started with just 10 students and has grown to 65 in a few years. What made this stand out was not the growth itself but the feedback from employers. TSMC told Purdue that students who went through the VIP program arrived with a knowledge base so far ahead of typical new hires that it saved the company a year and a half of internal training. That is not a minor efficiency gain. That is a fundamentally different level of readiness.</w:t>
+        <w:rPr>
+          <w:rFonts w:ascii="Times New Roman" w:hAnsi="Times New Roman"/>
+          <w:sz w:val="24"/>
+        </w:rPr>
+        <w:t>What stood out to me about this lecture was not just what Dr. Chen teaches but how it exposes a gap in the way most of us are educated. She walked a room full of MBA students through atomic structures, transistor physics, and manufacturing yield rates, and it landed. Not because we are suddenly qualified to work in a cleanroom, but because understanding the basics of how chips are made changes how you think about the companies that make them, the supply chains they depend on, and the investment decisions surrounding them. Most business programs do not require any exposure to the physical sciences behind the industries we study. After this lecture, that feels like a blind spot. You cannot fully evaluate a semiconductor company's competitive position if you do not understand why yield rates matter or why introducing a new material into a fab costs billions.</w:t>
       </w:r>
     </w:p>
     <w:p>
       <w:pPr>
+        <w:spacing w:line="480" w:lineRule="auto"/>
         <w:ind w:firstLine="720"/>
       </w:pPr>
       <w:r>
-        <w:t>The digital twin initiative she mentioned toward the end also caught my attention. Building a virtual replica of the Birck cleanroom so students can train in an immersive environment before ever touching real equipment addresses two problems at once: safety, since the cleanroom contains toxic gases and hazardous chemicals, and cost, since every hour of training on multimillion dollar machines ties up resources that researchers also need. If this kind of simulation based education scales, it could reshape how technical training works across many industries, not just semiconductors.</w:t>
+        <w:rPr>
+          <w:rFonts w:ascii="Times New Roman" w:hAnsi="Times New Roman"/>
+          <w:sz w:val="24"/>
+        </w:rPr>
+        <w:t>Dr. Chen also demonstrated something about how technical education itself is changing. The VIP program at Birck puts undergraduates inside a real cleanroom working on actual equipment, and employers reported that those students arrive so far ahead of normal hires that it saves over a year of corporate training. That says something important: classroom instruction alone, no matter how rigorous, cannot replicate the learning that comes from doing. The digital twin initiative she described, where students train in a virtual replica of the cleanroom before entering the real one, pushes that idea further. If you can make experiential learning safer and cheaper to deliver, the argument for keeping education purely theoretical gets much weaker.</w:t>
       </w:r>
     </w:p>
     <w:p>

</xml_diff>